<commit_message>
chore: Update Word protocol templates with tested changes
Update all LSZ and PP protocol templates after manual testing and validation.

Changes:
- Update LSZ templates (muzi/zeny, jeden/jedna)
- Update PP templates (muzi/zeny, jeden_MUZ/jeden_females)
- Templates tested and validated with single-worker and two-worker protocols
- All placeholders working correctly with new single-worker mode

🤖 Generated with [Claude Code](https://claude.com/claude-code)

Co-Authored-By: Claude <noreply@anthropic.com>
</commit_message>
<xml_diff>
--- a/sample_protocols/Autorizované protokoly pro MUŽE/PP_XX_Firma_Pozice.docx
+++ b/sample_protocols/Autorizované protokoly pro MUŽE/PP_XX_Firma_Pozice.docx
@@ -311,8 +311,9 @@
           <w:szCs w:val="28"/>
           <w:lang w:eastAsia="cs-CZ"/>
         </w:rPr>
-        <w:t xml:space="preserve"> </w:t>
-      </w:r>
+        <w:t xml:space="preserve"> {{section2_</w:t>
+      </w:r>
+      <w:proofErr w:type="gramStart"/>
       <w:r>
         <w:rPr>
           <w:rFonts w:asciiTheme="majorHAnsi" w:eastAsia="Times New Roman" w:hAnsiTheme="majorHAnsi" w:cs="Arial"/>
@@ -320,12 +321,11 @@
           <w:bCs/>
           <w:sz w:val="28"/>
           <w:szCs w:val="28"/>
-          <w:highlight w:val="magenta"/>
-          <w:lang w:eastAsia="cs-CZ"/>
-        </w:rPr>
-        <w:t>LSZ {{section2_</w:t>
-      </w:r>
-      <w:proofErr w:type="gramStart"/>
+          <w:lang w:eastAsia="cs-CZ"/>
+        </w:rPr>
+        <w:t>firma.evidence</w:t>
+      </w:r>
+      <w:proofErr w:type="gramEnd"/>
       <w:r>
         <w:rPr>
           <w:rFonts w:asciiTheme="majorHAnsi" w:eastAsia="Times New Roman" w:hAnsiTheme="majorHAnsi" w:cs="Arial"/>
@@ -333,12 +333,11 @@
           <w:bCs/>
           <w:sz w:val="28"/>
           <w:szCs w:val="28"/>
-          <w:highlight w:val="magenta"/>
-          <w:lang w:eastAsia="cs-CZ"/>
-        </w:rPr>
-        <w:t>firma.evidence</w:t>
-      </w:r>
-      <w:proofErr w:type="gramEnd"/>
+          <w:lang w:eastAsia="cs-CZ"/>
+        </w:rPr>
+        <w:t>_number</w:t>
+      </w:r>
+      <w:proofErr w:type="gramStart"/>
       <w:r>
         <w:rPr>
           <w:rFonts w:asciiTheme="majorHAnsi" w:eastAsia="Times New Roman" w:hAnsiTheme="majorHAnsi" w:cs="Arial"/>
@@ -346,12 +345,11 @@
           <w:bCs/>
           <w:sz w:val="28"/>
           <w:szCs w:val="28"/>
-          <w:highlight w:val="magenta"/>
-          <w:lang w:eastAsia="cs-CZ"/>
-        </w:rPr>
-        <w:t>_number</w:t>
-      </w:r>
-      <w:proofErr w:type="gramStart"/>
+          <w:lang w:eastAsia="cs-CZ"/>
+        </w:rPr>
+        <w:t>}}/</w:t>
+      </w:r>
+      <w:proofErr w:type="gramEnd"/>
       <w:r>
         <w:rPr>
           <w:rFonts w:asciiTheme="majorHAnsi" w:eastAsia="Times New Roman" w:hAnsiTheme="majorHAnsi" w:cs="Arial"/>
@@ -359,57 +357,31 @@
           <w:bCs/>
           <w:sz w:val="28"/>
           <w:szCs w:val="28"/>
-          <w:highlight w:val="magenta"/>
-          <w:lang w:eastAsia="cs-CZ"/>
-        </w:rPr>
-        <w:t>}}</w:t>
-      </w:r>
-      <w:r>
+          <w:lang w:eastAsia="cs-CZ"/>
+        </w:rPr>
+        <w:t>2025</w:t>
+      </w:r>
+    </w:p>
+    <w:p>
+      <w:pPr>
         <w:rPr>
           <w:rFonts w:asciiTheme="majorHAnsi" w:eastAsia="Times New Roman" w:hAnsiTheme="majorHAnsi" w:cs="Arial"/>
           <w:b/>
           <w:bCs/>
           <w:sz w:val="28"/>
           <w:szCs w:val="28"/>
-          <w:highlight w:val="magenta"/>
-          <w:lang w:eastAsia="cs-CZ"/>
-        </w:rPr>
-        <w:t>/</w:t>
-      </w:r>
-      <w:proofErr w:type="gramEnd"/>
-      <w:r>
+          <w:lang w:eastAsia="cs-CZ"/>
+        </w:rPr>
+      </w:pPr>
+    </w:p>
+    <w:p>
+      <w:pPr>
         <w:rPr>
           <w:rFonts w:asciiTheme="majorHAnsi" w:eastAsia="Times New Roman" w:hAnsiTheme="majorHAnsi" w:cs="Arial"/>
           <w:b/>
           <w:bCs/>
           <w:sz w:val="28"/>
           <w:szCs w:val="28"/>
-          <w:highlight w:val="magenta"/>
-          <w:lang w:eastAsia="cs-CZ"/>
-        </w:rPr>
-        <w:t>2025</w:t>
-      </w:r>
-    </w:p>
-    <w:p>
-      <w:pPr>
-        <w:rPr>
-          <w:rFonts w:asciiTheme="majorHAnsi" w:eastAsia="Times New Roman" w:hAnsiTheme="majorHAnsi" w:cs="Arial"/>
-          <w:b/>
-          <w:bCs/>
-          <w:sz w:val="28"/>
-          <w:szCs w:val="28"/>
-          <w:lang w:eastAsia="cs-CZ"/>
-        </w:rPr>
-      </w:pPr>
-    </w:p>
-    <w:p>
-      <w:pPr>
-        <w:rPr>
-          <w:rFonts w:asciiTheme="majorHAnsi" w:eastAsia="Times New Roman" w:hAnsiTheme="majorHAnsi" w:cs="Arial"/>
-          <w:b/>
-          <w:bCs/>
-          <w:sz w:val="28"/>
-          <w:szCs w:val="28"/>
           <w:lang w:eastAsia="cs-CZ"/>
         </w:rPr>
       </w:pPr>
@@ -422,7 +394,6 @@
           <w:b/>
           <w:sz w:val="24"/>
           <w:szCs w:val="24"/>
-          <w:highlight w:val="magenta"/>
           <w:lang w:eastAsia="cs-CZ"/>
         </w:rPr>
       </w:pPr>
@@ -450,7 +421,6 @@
           <w:b/>
           <w:sz w:val="24"/>
           <w:szCs w:val="23"/>
-          <w:highlight w:val="magenta"/>
           <w:lang w:eastAsia="cs-CZ"/>
         </w:rPr>
         <w:t>{{section2_</w:t>
@@ -462,7 +432,6 @@
           <w:b/>
           <w:sz w:val="24"/>
           <w:szCs w:val="23"/>
-          <w:highlight w:val="magenta"/>
           <w:lang w:eastAsia="cs-CZ"/>
         </w:rPr>
         <w:t>firma.company</w:t>
@@ -474,7 +443,6 @@
           <w:b/>
           <w:sz w:val="24"/>
           <w:szCs w:val="23"/>
-          <w:highlight w:val="magenta"/>
           <w:lang w:eastAsia="cs-CZ"/>
         </w:rPr>
         <w:t>}}</w:t>
@@ -488,7 +456,6 @@
           <w:b/>
           <w:sz w:val="24"/>
           <w:szCs w:val="23"/>
-          <w:highlight w:val="magenta"/>
           <w:lang w:eastAsia="cs-CZ"/>
         </w:rPr>
       </w:pPr>
@@ -498,7 +465,6 @@
           <w:b/>
           <w:sz w:val="24"/>
           <w:szCs w:val="23"/>
-          <w:highlight w:val="magenta"/>
           <w:lang w:eastAsia="cs-CZ"/>
         </w:rPr>
         <w:t>{{section2_</w:t>
@@ -510,7 +476,6 @@
           <w:b/>
           <w:sz w:val="24"/>
           <w:szCs w:val="23"/>
-          <w:highlight w:val="magenta"/>
           <w:lang w:eastAsia="cs-CZ"/>
         </w:rPr>
         <w:t>firma.address</w:t>
@@ -522,79 +487,75 @@
           <w:b/>
           <w:sz w:val="24"/>
           <w:szCs w:val="23"/>
-          <w:highlight w:val="magenta"/>
-          <w:lang w:eastAsia="cs-CZ"/>
-        </w:rPr>
-        <w:t>}}</w:t>
-      </w:r>
+          <w:lang w:eastAsia="cs-CZ"/>
+        </w:rPr>
+        <w:t>}} {{section2_</w:t>
+      </w:r>
+      <w:proofErr w:type="gramStart"/>
       <w:r>
         <w:rPr>
           <w:rFonts w:ascii="Cambria" w:eastAsia="Times New Roman" w:hAnsi="Cambria" w:cs="Arial CE"/>
           <w:b/>
           <w:sz w:val="24"/>
           <w:szCs w:val="23"/>
-          <w:highlight w:val="magenta"/>
-          <w:lang w:eastAsia="cs-CZ"/>
-        </w:rPr>
-        <w:t xml:space="preserve"> {{section2_</w:t>
-      </w:r>
-      <w:proofErr w:type="gramStart"/>
+          <w:lang w:eastAsia="cs-CZ"/>
+        </w:rPr>
+        <w:t>firma.house</w:t>
+      </w:r>
+      <w:proofErr w:type="gramEnd"/>
       <w:r>
         <w:rPr>
           <w:rFonts w:ascii="Cambria" w:eastAsia="Times New Roman" w:hAnsi="Cambria" w:cs="Arial CE"/>
           <w:b/>
           <w:sz w:val="24"/>
           <w:szCs w:val="23"/>
-          <w:highlight w:val="magenta"/>
-          <w:lang w:eastAsia="cs-CZ"/>
-        </w:rPr>
-        <w:t>firma.house</w:t>
-      </w:r>
-      <w:proofErr w:type="gramEnd"/>
+          <w:lang w:eastAsia="cs-CZ"/>
+        </w:rPr>
+        <w:t>_number}}</w:t>
+      </w:r>
+    </w:p>
+    <w:p>
+      <w:pPr>
+        <w:ind w:left="3540"/>
+        <w:rPr>
+          <w:rFonts w:asciiTheme="majorHAnsi" w:hAnsiTheme="majorHAnsi"/>
+          <w:b/>
+          <w:sz w:val="24"/>
+          <w:szCs w:val="24"/>
+          <w:lang w:eastAsia="cs-CZ"/>
+        </w:rPr>
+      </w:pPr>
       <w:r>
         <w:rPr>
           <w:rFonts w:ascii="Cambria" w:eastAsia="Times New Roman" w:hAnsi="Cambria" w:cs="Arial CE"/>
           <w:b/>
           <w:sz w:val="24"/>
           <w:szCs w:val="23"/>
-          <w:highlight w:val="magenta"/>
-          <w:lang w:eastAsia="cs-CZ"/>
-        </w:rPr>
-        <w:t>_number</w:t>
-      </w:r>
+          <w:lang w:eastAsia="cs-CZ"/>
+        </w:rPr>
+        <w:t>{{section2_</w:t>
+      </w:r>
+      <w:proofErr w:type="gramStart"/>
       <w:r>
         <w:rPr>
           <w:rFonts w:ascii="Cambria" w:eastAsia="Times New Roman" w:hAnsi="Cambria" w:cs="Arial CE"/>
           <w:b/>
           <w:sz w:val="24"/>
           <w:szCs w:val="23"/>
-          <w:highlight w:val="magenta"/>
-          <w:lang w:eastAsia="cs-CZ"/>
-        </w:rPr>
-        <w:t>}}</w:t>
-      </w:r>
-    </w:p>
-    <w:p>
-      <w:pPr>
-        <w:ind w:left="3540"/>
-        <w:rPr>
-          <w:rFonts w:asciiTheme="majorHAnsi" w:hAnsiTheme="majorHAnsi"/>
-          <w:b/>
-          <w:sz w:val="24"/>
-          <w:szCs w:val="24"/>
-          <w:lang w:eastAsia="cs-CZ"/>
-        </w:rPr>
-      </w:pPr>
+          <w:lang w:eastAsia="cs-CZ"/>
+        </w:rPr>
+        <w:t>firma.city</w:t>
+      </w:r>
+      <w:proofErr w:type="gramEnd"/>
       <w:r>
         <w:rPr>
           <w:rFonts w:ascii="Cambria" w:eastAsia="Times New Roman" w:hAnsi="Cambria" w:cs="Arial CE"/>
           <w:b/>
           <w:sz w:val="24"/>
           <w:szCs w:val="23"/>
-          <w:highlight w:val="magenta"/>
-          <w:lang w:eastAsia="cs-CZ"/>
-        </w:rPr>
-        <w:t>{{section2_</w:t>
+          <w:lang w:eastAsia="cs-CZ"/>
+        </w:rPr>
+        <w:t>}} {{section2_</w:t>
       </w:r>
       <w:proofErr w:type="gramStart"/>
       <w:r>
@@ -603,7 +564,6 @@
           <w:b/>
           <w:sz w:val="24"/>
           <w:szCs w:val="23"/>
-          <w:highlight w:val="magenta"/>
           <w:lang w:eastAsia="cs-CZ"/>
         </w:rPr>
         <w:t>firma.city</w:t>
@@ -615,102 +575,31 @@
           <w:b/>
           <w:sz w:val="24"/>
           <w:szCs w:val="23"/>
-          <w:highlight w:val="magenta"/>
-          <w:lang w:eastAsia="cs-CZ"/>
-        </w:rPr>
-        <w:t>}}</w:t>
-      </w:r>
+          <w:lang w:eastAsia="cs-CZ"/>
+        </w:rPr>
+        <w:t>_district}} {{section2_</w:t>
+      </w:r>
+      <w:proofErr w:type="gramStart"/>
       <w:r>
         <w:rPr>
           <w:rFonts w:ascii="Cambria" w:eastAsia="Times New Roman" w:hAnsi="Cambria" w:cs="Arial CE"/>
           <w:b/>
           <w:sz w:val="24"/>
           <w:szCs w:val="23"/>
-          <w:highlight w:val="magenta"/>
-          <w:lang w:eastAsia="cs-CZ"/>
-        </w:rPr>
-        <w:t xml:space="preserve"> {{section2_</w:t>
-      </w:r>
-      <w:proofErr w:type="gramStart"/>
+          <w:lang w:eastAsia="cs-CZ"/>
+        </w:rPr>
+        <w:t>firma.postal</w:t>
+      </w:r>
+      <w:proofErr w:type="gramEnd"/>
       <w:r>
         <w:rPr>
           <w:rFonts w:ascii="Cambria" w:eastAsia="Times New Roman" w:hAnsi="Cambria" w:cs="Arial CE"/>
           <w:b/>
           <w:sz w:val="24"/>
           <w:szCs w:val="23"/>
-          <w:highlight w:val="magenta"/>
-          <w:lang w:eastAsia="cs-CZ"/>
-        </w:rPr>
-        <w:t>firma.city</w:t>
-      </w:r>
-      <w:proofErr w:type="gramEnd"/>
-      <w:r>
-        <w:rPr>
-          <w:rFonts w:ascii="Cambria" w:eastAsia="Times New Roman" w:hAnsi="Cambria" w:cs="Arial CE"/>
-          <w:b/>
-          <w:sz w:val="24"/>
-          <w:szCs w:val="23"/>
-          <w:highlight w:val="magenta"/>
-          <w:lang w:eastAsia="cs-CZ"/>
-        </w:rPr>
-        <w:t>_district</w:t>
-      </w:r>
-      <w:r>
-        <w:rPr>
-          <w:rFonts w:ascii="Cambria" w:eastAsia="Times New Roman" w:hAnsi="Cambria" w:cs="Arial CE"/>
-          <w:b/>
-          <w:sz w:val="24"/>
-          <w:szCs w:val="23"/>
-          <w:highlight w:val="magenta"/>
-          <w:lang w:eastAsia="cs-CZ"/>
-        </w:rPr>
-        <w:t>}}</w:t>
-      </w:r>
-      <w:r>
-        <w:rPr>
-          <w:rFonts w:ascii="Cambria" w:eastAsia="Times New Roman" w:hAnsi="Cambria" w:cs="Arial CE"/>
-          <w:b/>
-          <w:sz w:val="24"/>
-          <w:szCs w:val="23"/>
-          <w:highlight w:val="magenta"/>
-          <w:lang w:eastAsia="cs-CZ"/>
-        </w:rPr>
-        <w:t xml:space="preserve"> {{section2_</w:t>
-      </w:r>
-      <w:proofErr w:type="gramStart"/>
-      <w:r>
-        <w:rPr>
-          <w:rFonts w:ascii="Cambria" w:eastAsia="Times New Roman" w:hAnsi="Cambria" w:cs="Arial CE"/>
-          <w:b/>
-          <w:sz w:val="24"/>
-          <w:szCs w:val="23"/>
-          <w:highlight w:val="magenta"/>
-          <w:lang w:eastAsia="cs-CZ"/>
-        </w:rPr>
-        <w:t>firma.postal</w:t>
-      </w:r>
-      <w:proofErr w:type="gramEnd"/>
-      <w:r>
-        <w:rPr>
-          <w:rFonts w:ascii="Cambria" w:eastAsia="Times New Roman" w:hAnsi="Cambria" w:cs="Arial CE"/>
-          <w:b/>
-          <w:sz w:val="24"/>
-          <w:szCs w:val="23"/>
-          <w:highlight w:val="magenta"/>
-          <w:lang w:eastAsia="cs-CZ"/>
-        </w:rPr>
-        <w:t>_code</w:t>
-      </w:r>
-      <w:r>
-        <w:rPr>
-          <w:rFonts w:ascii="Cambria" w:eastAsia="Times New Roman" w:hAnsi="Cambria" w:cs="Arial CE"/>
-          <w:b/>
-          <w:sz w:val="24"/>
-          <w:szCs w:val="23"/>
-          <w:highlight w:val="magenta"/>
-          <w:lang w:eastAsia="cs-CZ"/>
-        </w:rPr>
-        <w:t>}}</w:t>
+          <w:lang w:eastAsia="cs-CZ"/>
+        </w:rPr>
+        <w:t>_code}}</w:t>
       </w:r>
     </w:p>
     <w:p>
@@ -788,21 +677,9 @@
           <w:b/>
           <w:sz w:val="24"/>
           <w:szCs w:val="23"/>
-          <w:highlight w:val="magenta"/>
-          <w:lang w:eastAsia="cs-CZ"/>
-        </w:rPr>
-        <w:t>{{section2_firma.ico</w:t>
-      </w:r>
-      <w:r>
-        <w:rPr>
-          <w:rFonts w:ascii="Cambria" w:eastAsia="Times New Roman" w:hAnsi="Cambria" w:cs="Arial CE"/>
-          <w:b/>
-          <w:sz w:val="24"/>
-          <w:szCs w:val="23"/>
-          <w:highlight w:val="magenta"/>
-          <w:lang w:eastAsia="cs-CZ"/>
-        </w:rPr>
-        <w:t>}}</w:t>
+          <w:lang w:eastAsia="cs-CZ"/>
+        </w:rPr>
+        <w:t>{{section2_firma.ico}}</w:t>
       </w:r>
     </w:p>
     <w:p>
@@ -879,7 +756,6 @@
           <w:b/>
           <w:sz w:val="24"/>
           <w:szCs w:val="24"/>
-          <w:highlight w:val="magenta"/>
           <w:lang w:eastAsia="cs-CZ"/>
         </w:rPr>
         <w:t>{{section2_</w:t>
@@ -891,7 +767,6 @@
           <w:b/>
           <w:sz w:val="24"/>
           <w:szCs w:val="24"/>
-          <w:highlight w:val="magenta"/>
           <w:lang w:eastAsia="cs-CZ"/>
         </w:rPr>
         <w:t>firma.profession</w:t>
@@ -903,7 +778,6 @@
           <w:b/>
           <w:sz w:val="24"/>
           <w:szCs w:val="24"/>
-          <w:highlight w:val="magenta"/>
           <w:lang w:eastAsia="cs-CZ"/>
         </w:rPr>
         <w:t>_name}}</w:t>
@@ -952,7 +826,6 @@
           <w:b/>
           <w:sz w:val="24"/>
           <w:szCs w:val="24"/>
-          <w:highlight w:val="magenta"/>
           <w:lang w:eastAsia="cs-CZ"/>
         </w:rPr>
         <w:t>{{section2_</w:t>
@@ -964,7 +837,6 @@
           <w:b/>
           <w:sz w:val="24"/>
           <w:szCs w:val="24"/>
-          <w:highlight w:val="magenta"/>
           <w:lang w:eastAsia="cs-CZ"/>
         </w:rPr>
         <w:t>firma.workplace</w:t>
@@ -976,7 +848,6 @@
           <w:b/>
           <w:sz w:val="24"/>
           <w:szCs w:val="24"/>
-          <w:highlight w:val="magenta"/>
           <w:lang w:eastAsia="cs-CZ"/>
         </w:rPr>
         <w:t>}}</w:t>
@@ -1159,7 +1030,6 @@
           <w:b/>
           <w:sz w:val="24"/>
           <w:szCs w:val="24"/>
-          <w:highlight w:val="magenta"/>
           <w:lang w:eastAsia="cs-CZ"/>
         </w:rPr>
         <w:t>{{</w:t>
@@ -1171,7 +1041,6 @@
           <w:b/>
           <w:sz w:val="24"/>
           <w:szCs w:val="24"/>
-          <w:highlight w:val="magenta"/>
           <w:lang w:eastAsia="cs-CZ"/>
         </w:rPr>
         <w:t>today_date</w:t>
@@ -1183,7 +1052,6 @@
           <w:b/>
           <w:sz w:val="24"/>
           <w:szCs w:val="24"/>
-          <w:highlight w:val="magenta"/>
           <w:lang w:eastAsia="cs-CZ"/>
         </w:rPr>
         <w:t>}}</w:t>
@@ -1241,7 +1109,6 @@
         <w:rPr>
           <w:sz w:val="20"/>
           <w:szCs w:val="20"/>
-          <w:highlight w:val="magenta"/>
           <w:lang w:eastAsia="cs-CZ"/>
         </w:rPr>
         <w:t>LSZ {{section2_</w:t>
@@ -1251,7 +1118,6 @@
         <w:rPr>
           <w:sz w:val="20"/>
           <w:szCs w:val="20"/>
-          <w:highlight w:val="magenta"/>
           <w:lang w:eastAsia="cs-CZ"/>
         </w:rPr>
         <w:t>firma.evidence</w:t>
@@ -1261,7 +1127,6 @@
         <w:rPr>
           <w:sz w:val="20"/>
           <w:szCs w:val="20"/>
-          <w:highlight w:val="magenta"/>
           <w:lang w:eastAsia="cs-CZ"/>
         </w:rPr>
         <w:t>_number</w:t>
@@ -1271,26 +1136,15 @@
         <w:rPr>
           <w:sz w:val="20"/>
           <w:szCs w:val="20"/>
-          <w:highlight w:val="magenta"/>
-          <w:lang w:eastAsia="cs-CZ"/>
-        </w:rPr>
-        <w:t>}}</w:t>
-      </w:r>
+          <w:lang w:eastAsia="cs-CZ"/>
+        </w:rPr>
+        <w:t>}}/</w:t>
+      </w:r>
+      <w:proofErr w:type="gramEnd"/>
       <w:r>
         <w:rPr>
           <w:sz w:val="20"/>
           <w:szCs w:val="20"/>
-          <w:highlight w:val="magenta"/>
-          <w:lang w:eastAsia="cs-CZ"/>
-        </w:rPr>
-        <w:t>/</w:t>
-      </w:r>
-      <w:proofErr w:type="gramEnd"/>
-      <w:r>
-        <w:rPr>
-          <w:sz w:val="20"/>
-          <w:szCs w:val="20"/>
-          <w:highlight w:val="magenta"/>
           <w:lang w:eastAsia="cs-CZ"/>
         </w:rPr>
         <w:t>2025</w:t>
@@ -1981,7 +1835,6 @@
       </w:r>
       <w:r>
         <w:rPr>
-          <w:highlight w:val="magenta"/>
           <w:lang w:eastAsia="cs-CZ"/>
         </w:rPr>
         <w:t>{{section4_worker_</w:t>
@@ -1989,7 +1842,6 @@
       <w:proofErr w:type="gramStart"/>
       <w:r>
         <w:rPr>
-          <w:highlight w:val="magenta"/>
           <w:lang w:eastAsia="cs-CZ"/>
         </w:rPr>
         <w:t>a.initials</w:t>
@@ -1997,36 +1849,13 @@
       <w:proofErr w:type="gramEnd"/>
       <w:r>
         <w:rPr>
-          <w:highlight w:val="magenta"/>
-          <w:lang w:eastAsia="cs-CZ"/>
-        </w:rPr>
-        <w:t>|czech}}</w:t>
-      </w:r>
-      <w:r>
-        <w:rPr>
-          <w:highlight w:val="magenta"/>
-          <w:lang w:eastAsia="cs-CZ"/>
-        </w:rPr>
-        <w:t>,</w:t>
-      </w:r>
-      <w:r>
-        <w:rPr>
-          <w:highlight w:val="yellow"/>
-          <w:lang w:eastAsia="cs-CZ"/>
-        </w:rPr>
-        <w:t xml:space="preserve"> </w:t>
-      </w:r>
-      <w:r>
-        <w:rPr>
-          <w:highlight w:val="magenta"/>
-          <w:lang w:eastAsia="cs-CZ"/>
-        </w:rPr>
-        <w:t>{{section5_worker_</w:t>
+          <w:lang w:eastAsia="cs-CZ"/>
+        </w:rPr>
+        <w:t>|czech}}, {{section5_worker_</w:t>
       </w:r>
       <w:proofErr w:type="gramStart"/>
       <w:r>
         <w:rPr>
-          <w:highlight w:val="magenta"/>
           <w:lang w:eastAsia="cs-CZ"/>
         </w:rPr>
         <w:t>b.initials</w:t>
@@ -2034,17 +1863,9 @@
       <w:proofErr w:type="gramEnd"/>
       <w:r>
         <w:rPr>
-          <w:highlight w:val="magenta"/>
-          <w:lang w:eastAsia="cs-CZ"/>
-        </w:rPr>
-        <w:t>|czech}}</w:t>
-      </w:r>
-      <w:r>
-        <w:rPr>
-          <w:highlight w:val="magenta"/>
-          <w:lang w:eastAsia="cs-CZ"/>
-        </w:rPr>
-        <w:t xml:space="preserve">), </w:t>
+          <w:lang w:eastAsia="cs-CZ"/>
+        </w:rPr>
+        <w:t xml:space="preserve">|czech}}), </w:t>
       </w:r>
       <w:r>
         <w:rPr>
@@ -2069,7 +1890,6 @@
         <w:rPr>
           <w:i/>
           <w:szCs w:val="20"/>
-          <w:highlight w:val="magenta"/>
           <w:lang w:eastAsia="cs-CZ"/>
         </w:rPr>
         <w:t>{{section2_</w:t>
@@ -2079,7 +1899,6 @@
         <w:rPr>
           <w:i/>
           <w:szCs w:val="20"/>
-          <w:highlight w:val="magenta"/>
           <w:lang w:eastAsia="cs-CZ"/>
         </w:rPr>
         <w:t>firma.workplace</w:t>
@@ -2089,19 +1908,9 @@
         <w:rPr>
           <w:i/>
           <w:szCs w:val="20"/>
-          <w:highlight w:val="magenta"/>
-          <w:lang w:eastAsia="cs-CZ"/>
-        </w:rPr>
-        <w:t>|czech}}</w:t>
-      </w:r>
-      <w:r>
-        <w:rPr>
-          <w:i/>
-          <w:szCs w:val="20"/>
-          <w:highlight w:val="magenta"/>
-          <w:lang w:eastAsia="cs-CZ"/>
-        </w:rPr>
-        <w:t xml:space="preserve"> </w:t>
+          <w:lang w:eastAsia="cs-CZ"/>
+        </w:rPr>
+        <w:t xml:space="preserve">|czech}} </w:t>
       </w:r>
       <w:r>
         <w:rPr>
@@ -2115,7 +1924,6 @@
           <w:rFonts w:cstheme="minorHAnsi"/>
           <w:i/>
           <w:szCs w:val="20"/>
-          <w:highlight w:val="magenta"/>
           <w:lang w:eastAsia="cs-CZ"/>
         </w:rPr>
         <w:t>{{section2_</w:t>
@@ -2126,7 +1934,6 @@
           <w:rFonts w:cstheme="minorHAnsi"/>
           <w:i/>
           <w:szCs w:val="20"/>
-          <w:highlight w:val="magenta"/>
           <w:lang w:eastAsia="cs-CZ"/>
         </w:rPr>
         <w:t>firma.profession</w:t>
@@ -2137,35 +1944,11 @@
           <w:rFonts w:cstheme="minorHAnsi"/>
           <w:i/>
           <w:szCs w:val="20"/>
-          <w:highlight w:val="magenta"/>
-          <w:lang w:eastAsia="cs-CZ"/>
-        </w:rPr>
-        <w:t>_name</w:t>
-      </w:r>
-      <w:r>
-        <w:rPr>
-          <w:rFonts w:cstheme="minorHAnsi"/>
-          <w:i/>
-          <w:szCs w:val="20"/>
-          <w:highlight w:val="magenta"/>
-          <w:lang w:eastAsia="cs-CZ"/>
-        </w:rPr>
-        <w:t>|czech}}</w:t>
-      </w:r>
-      <w:r>
-        <w:rPr>
-          <w:rFonts w:cstheme="minorHAnsi"/>
-          <w:i/>
-          <w:szCs w:val="20"/>
-          <w:highlight w:val="magenta"/>
-          <w:lang w:eastAsia="cs-CZ"/>
-        </w:rPr>
-        <w:t>.</w:t>
-      </w:r>
-      <w:r>
-        <w:rPr>
-          <w:highlight w:val="magenta"/>
-        </w:rPr>
+          <w:lang w:eastAsia="cs-CZ"/>
+        </w:rPr>
+        <w:t>_name|czech}}.</w:t>
+      </w:r>
+      <w:r>
         <w:t xml:space="preserve"> </w:t>
       </w:r>
       <w:bookmarkEnd w:id="2"/>
@@ -2674,7 +2457,6 @@
               <w:rPr>
                 <w:rFonts w:cs="Calibri"/>
                 <w:szCs w:val="20"/>
-                <w:highlight w:val="magenta"/>
               </w:rPr>
               <w:t>{{section2_</w:t>
             </w:r>
@@ -2683,7 +2465,6 @@
               <w:rPr>
                 <w:rFonts w:cs="Calibri"/>
                 <w:szCs w:val="20"/>
-                <w:highlight w:val="magenta"/>
               </w:rPr>
               <w:t>firma.measurement</w:t>
             </w:r>
@@ -2692,17 +2473,8 @@
               <w:rPr>
                 <w:rFonts w:cs="Calibri"/>
                 <w:szCs w:val="20"/>
-                <w:highlight w:val="magenta"/>
-              </w:rPr>
-              <w:t>_date</w:t>
-            </w:r>
-            <w:r>
-              <w:rPr>
-                <w:rFonts w:cs="Calibri"/>
-                <w:szCs w:val="20"/>
-                <w:highlight w:val="magenta"/>
-              </w:rPr>
-              <w:t>|czech}}</w:t>
+              </w:rPr>
+              <w:t>_date|czech}}</w:t>
             </w:r>
           </w:p>
         </w:tc>
@@ -3173,7 +2945,6 @@
               <w:rPr>
                 <w:rFonts w:cs="Calibri"/>
                 <w:szCs w:val="20"/>
-                <w:highlight w:val="magenta"/>
               </w:rPr>
               <w:t>{{section2_</w:t>
             </w:r>
@@ -3182,7 +2953,6 @@
               <w:rPr>
                 <w:rFonts w:cs="Calibri"/>
                 <w:szCs w:val="20"/>
-                <w:highlight w:val="magenta"/>
               </w:rPr>
               <w:t>firma.measurement</w:t>
             </w:r>
@@ -3191,17 +2961,8 @@
               <w:rPr>
                 <w:rFonts w:cs="Calibri"/>
                 <w:szCs w:val="20"/>
-                <w:highlight w:val="magenta"/>
-              </w:rPr>
-              <w:t>_date</w:t>
-            </w:r>
-            <w:r>
-              <w:rPr>
-                <w:rFonts w:cs="Calibri"/>
-                <w:szCs w:val="20"/>
-                <w:highlight w:val="magenta"/>
-              </w:rPr>
-              <w:t>|czech}}</w:t>
+              </w:rPr>
+              <w:t>_date|czech}}</w:t>
             </w:r>
           </w:p>
         </w:tc>
@@ -17348,7 +17109,6 @@
             </w:pPr>
             <w:r>
               <w:rPr>
-                <w:highlight w:val="magenta"/>
                 <w:lang w:eastAsia="cs-CZ"/>
               </w:rPr>
               <w:t>{{section4_worker_</w:t>
@@ -17356,7 +17116,6 @@
             <w:proofErr w:type="gramStart"/>
             <w:r>
               <w:rPr>
-                <w:highlight w:val="magenta"/>
                 <w:lang w:eastAsia="cs-CZ"/>
               </w:rPr>
               <w:t>a.initials</w:t>
@@ -17364,22 +17123,13 @@
             <w:proofErr w:type="gramEnd"/>
             <w:r>
               <w:rPr>
-                <w:highlight w:val="magenta"/>
-                <w:lang w:eastAsia="cs-CZ"/>
-              </w:rPr>
-              <w:t>|czech}}</w:t>
-            </w:r>
-            <w:r>
-              <w:rPr>
-                <w:highlight w:val="magenta"/>
-                <w:lang w:eastAsia="cs-CZ"/>
-              </w:rPr>
-              <w:t>, {{section5_worker_</w:t>
+                <w:lang w:eastAsia="cs-CZ"/>
+              </w:rPr>
+              <w:t>|czech}}, {{section5_worker_</w:t>
             </w:r>
             <w:proofErr w:type="gramStart"/>
             <w:r>
               <w:rPr>
-                <w:highlight w:val="magenta"/>
                 <w:lang w:eastAsia="cs-CZ"/>
               </w:rPr>
               <w:t>b.initials</w:t>
@@ -17387,7 +17137,6 @@
             <w:proofErr w:type="gramEnd"/>
             <w:r>
               <w:rPr>
-                <w:highlight w:val="magenta"/>
                 <w:lang w:eastAsia="cs-CZ"/>
               </w:rPr>
               <w:t>|czech}}</w:t>
@@ -17457,7 +17206,6 @@
                 <w:rFonts w:cstheme="minorHAnsi"/>
                 <w:bCs/>
                 <w:szCs w:val="20"/>
-                <w:highlight w:val="magenta"/>
                 <w:lang w:eastAsia="cs-CZ"/>
               </w:rPr>
               <w:t>{{section2_</w:t>
@@ -17468,7 +17216,6 @@
                 <w:rFonts w:cstheme="minorHAnsi"/>
                 <w:bCs/>
                 <w:szCs w:val="20"/>
-                <w:highlight w:val="magenta"/>
                 <w:lang w:eastAsia="cs-CZ"/>
               </w:rPr>
               <w:t>firma.profession</w:t>
@@ -17479,20 +17226,9 @@
                 <w:rFonts w:cstheme="minorHAnsi"/>
                 <w:bCs/>
                 <w:szCs w:val="20"/>
-                <w:highlight w:val="magenta"/>
-                <w:lang w:eastAsia="cs-CZ"/>
-              </w:rPr>
-              <w:t>_name</w:t>
-            </w:r>
-            <w:r>
-              <w:rPr>
-                <w:rFonts w:cstheme="minorHAnsi"/>
-                <w:bCs/>
-                <w:szCs w:val="20"/>
-                <w:highlight w:val="magenta"/>
-                <w:lang w:eastAsia="cs-CZ"/>
-              </w:rPr>
-              <w:t>|czech}}</w:t>
+                <w:lang w:eastAsia="cs-CZ"/>
+              </w:rPr>
+              <w:t>_name|czech}}</w:t>
             </w:r>
           </w:p>
         </w:tc>
@@ -17560,7 +17296,6 @@
                 <w:rFonts w:cstheme="minorHAnsi"/>
                 <w:bCs/>
                 <w:szCs w:val="20"/>
-                <w:highlight w:val="magenta"/>
                 <w:lang w:eastAsia="cs-CZ"/>
               </w:rPr>
               <w:t>{{section2_</w:t>
@@ -17571,7 +17306,6 @@
                 <w:rFonts w:cstheme="minorHAnsi"/>
                 <w:bCs/>
                 <w:szCs w:val="20"/>
-                <w:highlight w:val="magenta"/>
                 <w:lang w:eastAsia="cs-CZ"/>
               </w:rPr>
               <w:t>firma.workplace</w:t>
@@ -17582,7 +17316,6 @@
                 <w:rFonts w:cstheme="minorHAnsi"/>
                 <w:bCs/>
                 <w:szCs w:val="20"/>
-                <w:highlight w:val="magenta"/>
                 <w:lang w:eastAsia="cs-CZ"/>
               </w:rPr>
               <w:t>|czech}}</w:t>
@@ -17684,7 +17417,6 @@
                 <w:rFonts w:cstheme="minorHAnsi"/>
                 <w:bCs/>
                 <w:szCs w:val="20"/>
-                <w:highlight w:val="magenta"/>
                 <w:lang w:eastAsia="cs-CZ"/>
               </w:rPr>
               <w:t>{{section4_worker_</w:t>
@@ -17695,7 +17427,6 @@
                 <w:rFonts w:cstheme="minorHAnsi"/>
                 <w:bCs/>
                 <w:szCs w:val="20"/>
-                <w:highlight w:val="magenta"/>
                 <w:lang w:eastAsia="cs-CZ"/>
               </w:rPr>
               <w:t>a.work</w:t>
@@ -17706,27 +17437,15 @@
                 <w:rFonts w:cstheme="minorHAnsi"/>
                 <w:bCs/>
                 <w:szCs w:val="20"/>
-                <w:highlight w:val="magenta"/>
-                <w:lang w:eastAsia="cs-CZ"/>
-              </w:rPr>
-              <w:t>_duration</w:t>
+                <w:lang w:eastAsia="cs-CZ"/>
+              </w:rPr>
+              <w:t>_duration|czech}}</w:t>
             </w:r>
             <w:r>
               <w:rPr>
                 <w:rFonts w:cstheme="minorHAnsi"/>
-                <w:bCs/>
+                <w:b/>
                 <w:szCs w:val="20"/>
-                <w:highlight w:val="magenta"/>
-                <w:lang w:eastAsia="cs-CZ"/>
-              </w:rPr>
-              <w:t>|czech}}</w:t>
-            </w:r>
-            <w:r>
-              <w:rPr>
-                <w:rFonts w:cstheme="minorHAnsi"/>
-                <w:b/>
-                <w:szCs w:val="20"/>
-                <w:highlight w:val="magenta"/>
                 <w:lang w:eastAsia="cs-CZ"/>
               </w:rPr>
               <w:t xml:space="preserve"> </w:t>
@@ -17795,7 +17514,6 @@
                 <w:rFonts w:cstheme="minorHAnsi"/>
                 <w:b/>
                 <w:szCs w:val="20"/>
-                <w:highlight w:val="magenta"/>
                 <w:lang w:eastAsia="cs-CZ"/>
               </w:rPr>
               <w:t>{{section4_worker_</w:t>
@@ -17806,7 +17524,6 @@
                 <w:rFonts w:cstheme="minorHAnsi"/>
                 <w:b/>
                 <w:szCs w:val="20"/>
-                <w:highlight w:val="magenta"/>
                 <w:lang w:eastAsia="cs-CZ"/>
               </w:rPr>
               <w:t>a.breaks</w:t>
@@ -17817,20 +17534,9 @@
                 <w:rFonts w:cstheme="minorHAnsi"/>
                 <w:b/>
                 <w:szCs w:val="20"/>
-                <w:highlight w:val="magenta"/>
-                <w:lang w:eastAsia="cs-CZ"/>
-              </w:rPr>
-              <w:t>|czech}}</w:t>
-            </w:r>
-            <w:r>
-              <w:rPr>
-                <w:rFonts w:cstheme="minorHAnsi"/>
-                <w:b/>
-                <w:szCs w:val="20"/>
-                <w:highlight w:val="magenta"/>
-                <w:lang w:eastAsia="cs-CZ"/>
-              </w:rPr>
-              <w:t xml:space="preserve"> </w:t>
+                <w:lang w:eastAsia="cs-CZ"/>
+              </w:rPr>
+              <w:t xml:space="preserve">|czech}} </w:t>
             </w:r>
             <w:r>
               <w:rPr>
@@ -17896,7 +17602,6 @@
                 <w:rFonts w:cstheme="minorHAnsi"/>
                 <w:bCs/>
                 <w:szCs w:val="20"/>
-                <w:highlight w:val="magenta"/>
                 <w:lang w:eastAsia="cs-CZ"/>
               </w:rPr>
               <w:t>{{section4_worker_</w:t>
@@ -17907,7 +17612,6 @@
                 <w:rFonts w:cstheme="minorHAnsi"/>
                 <w:bCs/>
                 <w:szCs w:val="20"/>
-                <w:highlight w:val="magenta"/>
                 <w:lang w:eastAsia="cs-CZ"/>
               </w:rPr>
               <w:t>a.work</w:t>
@@ -17918,20 +17622,56 @@
                 <w:rFonts w:cstheme="minorHAnsi"/>
                 <w:bCs/>
                 <w:szCs w:val="20"/>
-                <w:highlight w:val="magenta"/>
-                <w:lang w:eastAsia="cs-CZ"/>
-              </w:rPr>
-              <w:t>_duration</w:t>
-            </w:r>
+                <w:lang w:eastAsia="cs-CZ"/>
+              </w:rPr>
+              <w:t>_duration_min|czech</w:t>
+            </w:r>
+            <w:proofErr w:type="gramStart"/>
             <w:r>
               <w:rPr>
                 <w:rFonts w:cstheme="minorHAnsi"/>
                 <w:bCs/>
                 <w:szCs w:val="20"/>
-                <w:highlight w:val="magenta"/>
-                <w:lang w:eastAsia="cs-CZ"/>
-              </w:rPr>
-              <w:t>_min|czech</w:t>
+                <w:lang w:eastAsia="cs-CZ"/>
+              </w:rPr>
+              <w:t>}}</w:t>
+            </w:r>
+            <w:r>
+              <w:rPr>
+                <w:rFonts w:cstheme="minorHAnsi"/>
+                <w:b/>
+                <w:szCs w:val="20"/>
+                <w:lang w:eastAsia="cs-CZ"/>
+              </w:rPr>
+              <w:t xml:space="preserve"> </w:t>
+            </w:r>
+            <w:r>
+              <w:rPr>
+                <w:rFonts w:cstheme="minorHAnsi"/>
+                <w:bCs/>
+                <w:szCs w:val="20"/>
+                <w:lang w:eastAsia="cs-CZ"/>
+              </w:rPr>
+              <w:t xml:space="preserve"> min</w:t>
+            </w:r>
+            <w:proofErr w:type="gramEnd"/>
+            <w:r>
+              <w:rPr>
+                <w:rFonts w:cstheme="minorHAnsi"/>
+                <w:bCs/>
+                <w:szCs w:val="20"/>
+                <w:lang w:eastAsia="cs-CZ"/>
+              </w:rPr>
+              <w:t xml:space="preserve"> + </w:t>
+            </w:r>
+            <w:r>
+              <w:rPr>
+                <w:rFonts w:cstheme="minorHAnsi"/>
+                <w:bCs/>
+                <w:szCs w:val="20"/>
+                <w:lang w:eastAsia="cs-CZ"/>
+              </w:rPr>
+              <w:t>{{section4_worker_</w:t>
             </w:r>
             <w:proofErr w:type="gramStart"/>
             <w:r>
@@ -17939,7 +17679,26 @@
                 <w:rFonts w:cstheme="minorHAnsi"/>
                 <w:bCs/>
                 <w:szCs w:val="20"/>
-                <w:highlight w:val="magenta"/>
+                <w:lang w:eastAsia="cs-CZ"/>
+              </w:rPr>
+              <w:t>a.safety</w:t>
+            </w:r>
+            <w:proofErr w:type="gramEnd"/>
+            <w:r>
+              <w:rPr>
+                <w:rFonts w:cstheme="minorHAnsi"/>
+                <w:bCs/>
+                <w:szCs w:val="20"/>
+                <w:lang w:eastAsia="cs-CZ"/>
+              </w:rPr>
+              <w:t>_break_min|czech</w:t>
+            </w:r>
+            <w:proofErr w:type="gramStart"/>
+            <w:r>
+              <w:rPr>
+                <w:rFonts w:cstheme="minorHAnsi"/>
+                <w:bCs/>
+                <w:szCs w:val="20"/>
                 <w:lang w:eastAsia="cs-CZ"/>
               </w:rPr>
               <w:t>}}</w:t>
@@ -17949,89 +17708,6 @@
                 <w:rFonts w:cstheme="minorHAnsi"/>
                 <w:b/>
                 <w:szCs w:val="20"/>
-                <w:highlight w:val="magenta"/>
-                <w:lang w:eastAsia="cs-CZ"/>
-              </w:rPr>
-              <w:t xml:space="preserve"> </w:t>
-            </w:r>
-            <w:r>
-              <w:rPr>
-                <w:rFonts w:cstheme="minorHAnsi"/>
-                <w:bCs/>
-                <w:szCs w:val="20"/>
-                <w:lang w:eastAsia="cs-CZ"/>
-              </w:rPr>
-              <w:t xml:space="preserve"> min</w:t>
-            </w:r>
-            <w:proofErr w:type="gramEnd"/>
-            <w:r>
-              <w:rPr>
-                <w:rFonts w:cstheme="minorHAnsi"/>
-                <w:bCs/>
-                <w:szCs w:val="20"/>
-                <w:lang w:eastAsia="cs-CZ"/>
-              </w:rPr>
-              <w:t xml:space="preserve"> + </w:t>
-            </w:r>
-            <w:r>
-              <w:rPr>
-                <w:rFonts w:cstheme="minorHAnsi"/>
-                <w:bCs/>
-                <w:szCs w:val="20"/>
-                <w:highlight w:val="magenta"/>
-                <w:lang w:eastAsia="cs-CZ"/>
-              </w:rPr>
-              <w:t>{{section4_worker_</w:t>
-            </w:r>
-            <w:proofErr w:type="gramStart"/>
-            <w:r>
-              <w:rPr>
-                <w:rFonts w:cstheme="minorHAnsi"/>
-                <w:bCs/>
-                <w:szCs w:val="20"/>
-                <w:highlight w:val="magenta"/>
-                <w:lang w:eastAsia="cs-CZ"/>
-              </w:rPr>
-              <w:t>a.</w:t>
-            </w:r>
-            <w:r>
-              <w:rPr>
-                <w:rFonts w:cstheme="minorHAnsi"/>
-                <w:bCs/>
-                <w:szCs w:val="20"/>
-                <w:highlight w:val="magenta"/>
-                <w:lang w:eastAsia="cs-CZ"/>
-              </w:rPr>
-              <w:t>safety</w:t>
-            </w:r>
-            <w:proofErr w:type="gramEnd"/>
-            <w:r>
-              <w:rPr>
-                <w:rFonts w:cstheme="minorHAnsi"/>
-                <w:bCs/>
-                <w:szCs w:val="20"/>
-                <w:highlight w:val="magenta"/>
-                <w:lang w:eastAsia="cs-CZ"/>
-              </w:rPr>
-              <w:t>_break_min|czech</w:t>
-            </w:r>
-            <w:proofErr w:type="gramStart"/>
-            <w:r>
-              <w:rPr>
-                <w:rFonts w:cstheme="minorHAnsi"/>
-                <w:bCs/>
-                <w:szCs w:val="20"/>
-                <w:highlight w:val="magenta"/>
-                <w:lang w:eastAsia="cs-CZ"/>
-              </w:rPr>
-              <w:t>}}</w:t>
-            </w:r>
-            <w:r>
-              <w:rPr>
-                <w:rFonts w:cstheme="minorHAnsi"/>
-                <w:b/>
-                <w:szCs w:val="20"/>
-                <w:highlight w:val="magenta"/>
                 <w:lang w:eastAsia="cs-CZ"/>
               </w:rPr>
               <w:t xml:space="preserve"> </w:t>
@@ -19972,9 +19648,6 @@
       <w:pPr>
         <w:spacing w:after="120" w:line="276" w:lineRule="auto"/>
         <w:rPr>
-          <w:b/>
-          <w:szCs w:val="20"/>
-          <w:highlight w:val="yellow"/>
           <w:lang w:eastAsia="cs-CZ"/>
         </w:rPr>
       </w:pPr>
@@ -19984,6 +19657,38 @@
           <w:lang w:eastAsia="cs-CZ"/>
         </w:rPr>
         <w:t xml:space="preserve">Měření provedl: </w:t>
+      </w:r>
+      <w:r>
+        <w:rPr>
+          <w:lang w:eastAsia="cs-CZ"/>
+        </w:rPr>
+        <w:t>{{</w:t>
+      </w:r>
+      <w:r>
+        <w:rPr>
+          <w:lang w:eastAsia="cs-CZ"/>
+        </w:rPr>
+        <w:t>section6_</w:t>
+      </w:r>
+      <w:proofErr w:type="gramStart"/>
+      <w:r>
+        <w:rPr>
+          <w:lang w:eastAsia="cs-CZ"/>
+        </w:rPr>
+        <w:t>final</w:t>
+      </w:r>
+      <w:r>
+        <w:rPr>
+          <w:lang w:eastAsia="cs-CZ"/>
+        </w:rPr>
+        <w:t>.measured</w:t>
+      </w:r>
+      <w:proofErr w:type="gramEnd"/>
+      <w:r>
+        <w:rPr>
+          <w:lang w:eastAsia="cs-CZ"/>
+        </w:rPr>
+        <w:t>_by}}</w:t>
       </w:r>
     </w:p>
     <w:p>
@@ -20052,37 +19757,23 @@
       </w:r>
       <w:r>
         <w:rPr>
-          <w:highlight w:val="yellow"/>
-          <w:lang w:eastAsia="cs-CZ"/>
-        </w:rPr>
-        <w:t>DD</w:t>
-      </w:r>
-      <w:r>
-        <w:rPr>
-          <w:highlight w:val="yellow"/>
-          <w:lang w:eastAsia="cs-CZ"/>
-        </w:rPr>
-        <w:t xml:space="preserve">. </w:t>
-      </w:r>
-      <w:r>
-        <w:rPr>
-          <w:highlight w:val="yellow"/>
-          <w:lang w:eastAsia="cs-CZ"/>
-        </w:rPr>
-        <w:t>MM</w:t>
-      </w:r>
-      <w:r>
-        <w:rPr>
-          <w:highlight w:val="yellow"/>
-          <w:lang w:eastAsia="cs-CZ"/>
-        </w:rPr>
-        <w:t xml:space="preserve">. </w:t>
-      </w:r>
-      <w:r>
-        <w:rPr>
-          <w:lang w:eastAsia="cs-CZ"/>
-        </w:rPr>
-        <w:t>RRRR</w:t>
+          <w:lang w:eastAsia="cs-CZ"/>
+        </w:rPr>
+        <w:t>{{</w:t>
+      </w:r>
+      <w:proofErr w:type="spellStart"/>
+      <w:r>
+        <w:rPr>
+          <w:lang w:eastAsia="cs-CZ"/>
+        </w:rPr>
+        <w:t>today_date</w:t>
+      </w:r>
+      <w:proofErr w:type="spellEnd"/>
+      <w:r>
+        <w:rPr>
+          <w:lang w:eastAsia="cs-CZ"/>
+        </w:rPr>
+        <w:t>}}</w:t>
       </w:r>
     </w:p>
     <w:p>
@@ -20378,7 +20069,6 @@
               <w:bCs/>
               <w:sz w:val="18"/>
               <w:szCs w:val="18"/>
-              <w:highlight w:val="magenta"/>
               <w:lang w:eastAsia="cs-CZ"/>
             </w:rPr>
             <w:t>{{section2_</w:t>
@@ -20391,7 +20081,6 @@
               <w:bCs/>
               <w:sz w:val="18"/>
               <w:szCs w:val="18"/>
-              <w:highlight w:val="magenta"/>
               <w:lang w:eastAsia="cs-CZ"/>
             </w:rPr>
             <w:t>firma.evidence</w:t>
@@ -20404,7 +20093,6 @@
               <w:bCs/>
               <w:sz w:val="18"/>
               <w:szCs w:val="18"/>
-              <w:highlight w:val="magenta"/>
               <w:lang w:eastAsia="cs-CZ"/>
             </w:rPr>
             <w:t>_number</w:t>
@@ -20417,22 +20105,9 @@
               <w:bCs/>
               <w:sz w:val="18"/>
               <w:szCs w:val="18"/>
-              <w:highlight w:val="magenta"/>
               <w:lang w:eastAsia="cs-CZ"/>
             </w:rPr>
-            <w:t>}}</w:t>
-          </w:r>
-          <w:r>
-            <w:rPr>
-              <w:rFonts w:eastAsia="Times New Roman" w:cs="Calibri"/>
-              <w:b/>
-              <w:bCs/>
-              <w:sz w:val="18"/>
-              <w:szCs w:val="18"/>
-              <w:highlight w:val="magenta"/>
-              <w:lang w:eastAsia="cs-CZ"/>
-            </w:rPr>
-            <w:t>/</w:t>
+            <w:t>}}/</w:t>
           </w:r>
           <w:proofErr w:type="gramEnd"/>
           <w:r>
@@ -20442,7 +20117,6 @@
               <w:bCs/>
               <w:sz w:val="18"/>
               <w:szCs w:val="18"/>
-              <w:highlight w:val="magenta"/>
               <w:lang w:eastAsia="cs-CZ"/>
             </w:rPr>
             <w:t>2025</w:t>
@@ -20770,7 +20444,6 @@
               <w:bCs/>
               <w:sz w:val="18"/>
               <w:szCs w:val="18"/>
-              <w:highlight w:val="magenta"/>
               <w:lang w:eastAsia="cs-CZ"/>
             </w:rPr>
             <w:t>{{section2_</w:t>
@@ -20783,7 +20456,6 @@
               <w:bCs/>
               <w:sz w:val="18"/>
               <w:szCs w:val="18"/>
-              <w:highlight w:val="magenta"/>
               <w:lang w:eastAsia="cs-CZ"/>
             </w:rPr>
             <w:t>firma.evidence</w:t>
@@ -20796,7 +20468,6 @@
               <w:bCs/>
               <w:sz w:val="18"/>
               <w:szCs w:val="18"/>
-              <w:highlight w:val="magenta"/>
               <w:lang w:eastAsia="cs-CZ"/>
             </w:rPr>
             <w:t>_number</w:t>
@@ -20809,22 +20480,9 @@
               <w:bCs/>
               <w:sz w:val="18"/>
               <w:szCs w:val="18"/>
-              <w:highlight w:val="magenta"/>
               <w:lang w:eastAsia="cs-CZ"/>
             </w:rPr>
-            <w:t>}}</w:t>
-          </w:r>
-          <w:r>
-            <w:rPr>
-              <w:rFonts w:eastAsia="Times New Roman" w:cs="Calibri"/>
-              <w:b/>
-              <w:bCs/>
-              <w:sz w:val="18"/>
-              <w:szCs w:val="18"/>
-              <w:highlight w:val="magenta"/>
-              <w:lang w:eastAsia="cs-CZ"/>
-            </w:rPr>
-            <w:t>/</w:t>
+            <w:t>}}/</w:t>
           </w:r>
           <w:proofErr w:type="gramEnd"/>
           <w:r>
@@ -20834,7 +20492,6 @@
               <w:bCs/>
               <w:sz w:val="18"/>
               <w:szCs w:val="18"/>
-              <w:highlight w:val="magenta"/>
               <w:lang w:eastAsia="cs-CZ"/>
             </w:rPr>
             <w:t>2025</w:t>
@@ -21317,7 +20974,7 @@
         </mc:Choice>
         <mc:Fallback>
           <w:pict>
-            <v:line w14:anchorId="69AB293E" id="Přímá spojnice 4" o:spid="_x0000_s1026" style="position:absolute;z-index:251658240;visibility:visible;mso-wrap-style:square;mso-width-percent:0;mso-height-percent:0;mso-wrap-distance-left:9pt;mso-wrap-distance-top:-1e-4mm;mso-wrap-distance-right:9pt;mso-wrap-distance-bottom:-1e-4mm;mso-position-horizontal:absolute;mso-position-horizontal-relative:text;mso-position-vertical:absolute;mso-position-vertical-relative:text;mso-width-percent:0;mso-height-percent:0;mso-width-relative:margin;mso-height-relative:margin" from="-34.1pt,19.8pt" to="490.15pt,19.8pt" o:gfxdata="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">
+            <v:line w14:anchorId="766D6EEC" id="Přímá spojnice 4" o:spid="_x0000_s1026" style="position:absolute;z-index:251658240;visibility:visible;mso-wrap-style:square;mso-width-percent:0;mso-height-percent:0;mso-wrap-distance-left:9pt;mso-wrap-distance-top:-1e-4mm;mso-wrap-distance-right:9pt;mso-wrap-distance-bottom:-1e-4mm;mso-position-horizontal:absolute;mso-position-horizontal-relative:text;mso-position-vertical:absolute;mso-position-vertical-relative:text;mso-width-percent:0;mso-height-percent:0;mso-width-relative:margin;mso-height-relative:margin" from="-34.1pt,19.8pt" to="490.15pt,19.8pt" o:gfxdata="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">
               <o:lock v:ext="edit" shapetype="f"/>
             </v:line>
           </w:pict>

</xml_diff>